<commit_message>
Versión con la mejora para el patrocinio
</commit_message>
<xml_diff>
--- a/doc/individual.docx
+++ b/doc/individual.docx
@@ -1,6 +1,6 @@
 
 <file path=word/document.xml><?xml version="1.0" encoding="utf-8"?>
-<w:document xmlns:wpc="http://schemas.microsoft.com/office/word/2010/wordprocessingCanvas" xmlns:cx="http://schemas.microsoft.com/office/drawing/2014/chartex" xmlns:cx1="http://schemas.microsoft.com/office/drawing/2015/9/8/chartex" xmlns:cx2="http://schemas.microsoft.com/office/drawing/2015/10/21/chartex" xmlns:cx3="http://schemas.microsoft.com/office/drawing/2016/5/9/chartex" xmlns:cx4="http://schemas.microsoft.com/office/drawing/2016/5/10/chartex" xmlns:cx5="http://schemas.microsoft.com/office/drawing/2016/5/11/chartex" xmlns:cx6="http://schemas.microsoft.com/office/drawing/2016/5/12/chartex" xmlns:cx7="http://schemas.microsoft.com/office/drawing/2016/5/13/chartex" xmlns:cx8="http://schemas.microsoft.com/office/drawing/2016/5/14/chartex" xmlns:mc="http://schemas.openxmlformats.org/markup-compatibility/2006" xmlns:aink="http://schemas.microsoft.com/office/drawing/2016/ink" xmlns:am3d="http://schemas.microsoft.com/office/drawing/2017/model3d" xmlns:o="urn:schemas-microsoft-com:office:office" xmlns:oel="http://schemas.microsoft.com/office/2019/extlst" xmlns:r="http://schemas.openxmlformats.org/officeDocument/2006/relationships" xmlns:m="http://schemas.openxmlformats.org/officeDocument/2006/math" xmlns:v="urn:schemas-microsoft-com:vml" xmlns:wp14="http://schemas.microsoft.com/office/word/2010/wordprocessingDrawing" xmlns:wp="http://schemas.openxmlformats.org/drawingml/2006/wordprocessingDrawing" xmlns:w10="urn:schemas-microsoft-com:office:word" xmlns:w="http://schemas.openxmlformats.org/wordprocessingml/2006/main" xmlns:w14="http://schemas.microsoft.com/office/word/2010/wordml" xmlns:w15="http://schemas.microsoft.com/office/word/2012/wordml" xmlns:w16cex="http://schemas.microsoft.com/office/word/2018/wordml/cex" xmlns:w16cid="http://schemas.microsoft.com/office/word/2016/wordml/cid" xmlns:w16="http://schemas.microsoft.com/office/word/2018/wordml" xmlns:w16du="http://schemas.microsoft.com/office/word/2023/wordml/word16du" xmlns:w16sdtdh="http://schemas.microsoft.com/office/word/2020/wordml/sdtdatahash" xmlns:w16sdtfl="http://schemas.microsoft.com/office/word/2024/wordml/sdtformatlock" xmlns:w16se="http://schemas.microsoft.com/office/word/2015/wordml/symex" xmlns:wpg="http://schemas.microsoft.com/office/word/2010/wordprocessingGroup" xmlns:wpi="http://schemas.microsoft.com/office/word/2010/wordprocessingInk" xmlns:wne="http://schemas.microsoft.com/office/word/2006/wordml" xmlns:wps="http://schemas.microsoft.com/office/word/2010/wordprocessingShape" mc:Ignorable="w14 w15 w16se w16cid w16 w16cex w16sdtdh w16sdtfl w16du wp14">
+<w:document xmlns:wpc="http://schemas.microsoft.com/office/word/2010/wordprocessingCanvas" xmlns:cx="http://schemas.microsoft.com/office/drawing/2014/chartex" xmlns:cx1="http://schemas.microsoft.com/office/drawing/2015/9/8/chartex" xmlns:cx2="http://schemas.microsoft.com/office/drawing/2015/10/21/chartex" xmlns:cx3="http://schemas.microsoft.com/office/drawing/2016/5/9/chartex" xmlns:cx4="http://schemas.microsoft.com/office/drawing/2016/5/10/chartex" xmlns:cx5="http://schemas.microsoft.com/office/drawing/2016/5/11/chartex" xmlns:cx6="http://schemas.microsoft.com/office/drawing/2016/5/12/chartex" xmlns:cx7="http://schemas.microsoft.com/office/drawing/2016/5/13/chartex" xmlns:cx8="http://schemas.microsoft.com/office/drawing/2016/5/14/chartex" xmlns:mc="http://schemas.openxmlformats.org/markup-compatibility/2006" xmlns:aink="http://schemas.microsoft.com/office/drawing/2016/ink" xmlns:am3d="http://schemas.microsoft.com/office/drawing/2017/model3d" xmlns:o="urn:schemas-microsoft-com:office:office" xmlns:oel="http://schemas.microsoft.com/office/2019/extlst" xmlns:r="http://schemas.openxmlformats.org/officeDocument/2006/relationships" xmlns:m="http://schemas.openxmlformats.org/officeDocument/2006/math" xmlns:v="urn:schemas-microsoft-com:vml" xmlns:wp14="http://schemas.microsoft.com/office/word/2010/wordprocessingDrawing" xmlns:wp="http://schemas.openxmlformats.org/drawingml/2006/wordprocessingDrawing" xmlns:w10="urn:schemas-microsoft-com:office:word" xmlns:w="http://schemas.openxmlformats.org/wordprocessingml/2006/main" xmlns:w14="http://schemas.microsoft.com/office/word/2010/wordml" xmlns:w15="http://schemas.microsoft.com/office/word/2012/wordml" xmlns:w16cex="http://schemas.microsoft.com/office/word/2018/wordml/cex" xmlns:w16cid="http://schemas.microsoft.com/office/word/2016/wordml/cid" xmlns:w16="http://schemas.microsoft.com/office/word/2018/wordml" xmlns:w16sdtdh="http://schemas.microsoft.com/office/word/2020/wordml/sdtdatahash" xmlns:w16se="http://schemas.microsoft.com/office/word/2015/wordml/symex" xmlns:wpg="http://schemas.microsoft.com/office/word/2010/wordprocessingGroup" xmlns:wpi="http://schemas.microsoft.com/office/word/2010/wordprocessingInk" xmlns:wne="http://schemas.microsoft.com/office/word/2006/wordml" xmlns:wps="http://schemas.microsoft.com/office/word/2010/wordprocessingShape" mc:Ignorable="w14 w15 w16se w16cid w16 w16cex w16sdtdh wp14">
   <w:body>
     <w:p>
       <w:r>
@@ -2315,7 +2315,23 @@
                 <w:sz w:val="18"/>
                 <w:szCs w:val="18"/>
               </w:rPr>
-              <w:t>{NombresC}</w:t>
+              <w:t>{</w:t>
+            </w:r>
+            <w:proofErr w:type="spellStart"/>
+            <w:r>
+              <w:rPr>
+                <w:sz w:val="18"/>
+                <w:szCs w:val="18"/>
+              </w:rPr>
+              <w:t>NombresC</w:t>
+            </w:r>
+            <w:proofErr w:type="spellEnd"/>
+            <w:r>
+              <w:rPr>
+                <w:sz w:val="18"/>
+                <w:szCs w:val="18"/>
+              </w:rPr>
+              <w:t>}</w:t>
             </w:r>
           </w:p>
         </w:tc>
@@ -2413,7 +2429,23 @@
                 <w:sz w:val="18"/>
                 <w:szCs w:val="18"/>
               </w:rPr>
-              <w:t>{CarreraDocente}</w:t>
+              <w:t>{</w:t>
+            </w:r>
+            <w:proofErr w:type="spellStart"/>
+            <w:r>
+              <w:rPr>
+                <w:sz w:val="18"/>
+                <w:szCs w:val="18"/>
+              </w:rPr>
+              <w:t>CarreraDocente</w:t>
+            </w:r>
+            <w:proofErr w:type="spellEnd"/>
+            <w:r>
+              <w:rPr>
+                <w:sz w:val="18"/>
+                <w:szCs w:val="18"/>
+              </w:rPr>
+              <w:t>}</w:t>
             </w:r>
           </w:p>
         </w:tc>
@@ -5787,6 +5819,7 @@
                     <w:tab/>
                     <w:t xml:space="preserve">Total de horas de </w:t>
                   </w:r>
+                  <w:proofErr w:type="spellStart"/>
                   <w:r>
                     <w:rPr>
                       <w:spacing w:val="-2"/>
@@ -5795,6 +5828,7 @@
                     </w:rPr>
                     <w:t>capacitacion</w:t>
                   </w:r>
+                  <w:proofErr w:type="spellEnd"/>
                   <w:r>
                     <w:rPr>
                       <w:sz w:val="14"/>
@@ -6255,6 +6289,7 @@
                     </w:rPr>
                     <w:t>{/</w:t>
                   </w:r>
+                  <w:proofErr w:type="spellStart"/>
                   <w:r>
                     <w:rPr>
                       <w:rFonts w:ascii="Arial"/>
@@ -6269,7 +6304,16 @@
                       <w:b/>
                       <w:sz w:val="16"/>
                     </w:rPr>
-                    <w:t>a}</w:t>
+                    <w:t>a</w:t>
+                  </w:r>
+                  <w:proofErr w:type="spellEnd"/>
+                  <w:r>
+                    <w:rPr>
+                      <w:rFonts w:ascii="Arial"/>
+                      <w:b/>
+                      <w:sz w:val="16"/>
+                    </w:rPr>
+                    <w:t>}</w:t>
                   </w:r>
                 </w:p>
                 <w:p>
@@ -7101,11 +7145,19 @@
                       <w:sz w:val="14"/>
                     </w:rPr>
                   </w:pPr>
+                  <w:proofErr w:type="spellStart"/>
                   <w:r>
                     <w:rPr>
                       <w:sz w:val="14"/>
                     </w:rPr>
-                    <w:t>N° de profesoras cuyo máximo título es un grado</w:t>
+                    <w:t>N°</w:t>
+                  </w:r>
+                  <w:proofErr w:type="spellEnd"/>
+                  <w:r>
+                    <w:rPr>
+                      <w:sz w:val="14"/>
+                    </w:rPr>
+                    <w:t xml:space="preserve"> de profesoras cuyo máximo título es un grado</w:t>
                   </w:r>
                   <w:r>
                     <w:rPr>
@@ -7283,8 +7335,16 @@
                     <w:rPr>
                       <w:sz w:val="14"/>
                     </w:rPr>
-                    <w:t xml:space="preserve">                                              N°</w:t>
-                  </w:r>
+                    <w:t xml:space="preserve">                                              </w:t>
+                  </w:r>
+                  <w:proofErr w:type="spellStart"/>
+                  <w:r>
+                    <w:rPr>
+                      <w:sz w:val="14"/>
+                    </w:rPr>
+                    <w:t>N°</w:t>
+                  </w:r>
+                  <w:proofErr w:type="spellEnd"/>
                   <w:r>
                     <w:rPr>
                       <w:spacing w:val="-5"/>
@@ -7483,7 +7543,7 @@
                   <w:pPr>
                     <w:pStyle w:val="TableParagraph"/>
                     <w:spacing w:before="46" w:line="184" w:lineRule="exact"/>
-                    <w:ind w:left="1051"/>
+                    <w:jc w:val="center"/>
                     <w:rPr>
                       <w:rFonts w:ascii="Arial" w:hAnsi="Arial"/>
                       <w:b/>
@@ -7492,20 +7552,17 @@
                   </w:pPr>
                   <w:r>
                     <w:rPr>
-                      <w:rFonts w:ascii="Arial" w:hAnsi="Arial"/>
-                      <w:b/>
-                      <w:sz w:val="18"/>
-                    </w:rPr>
-                    <w:t xml:space="preserve">Situación Actual de </w:t>
-                  </w:r>
-                  <w:r>
-                    <w:rPr>
-                      <w:rFonts w:ascii="Arial" w:hAnsi="Arial"/>
-                      <w:b/>
-                      <w:spacing w:val="-2"/>
-                      <w:sz w:val="18"/>
-                    </w:rPr>
-                    <w:t>Formación</w:t>
+                      <w:b/>
+                      <w:sz w:val="18"/>
+                    </w:rPr>
+                    <w:t xml:space="preserve">Título Actual Registrado en la </w:t>
+                  </w:r>
+                  <w:r>
+                    <w:rPr>
+                      <w:b/>
+                      <w:sz w:val="18"/>
+                    </w:rPr>
+                    <w:t>SENESCYT</w:t>
                   </w:r>
                 </w:p>
               </w:tc>
@@ -7518,7 +7575,7 @@
                   <w:pPr>
                     <w:pStyle w:val="TableParagraph"/>
                     <w:spacing w:before="46" w:line="184" w:lineRule="exact"/>
-                    <w:ind w:left="892"/>
+                    <w:jc w:val="center"/>
                     <w:rPr>
                       <w:rFonts w:ascii="Arial" w:hAnsi="Arial"/>
                       <w:b/>
@@ -7531,16 +7588,33 @@
                       <w:b/>
                       <w:sz w:val="18"/>
                     </w:rPr>
-                    <w:t xml:space="preserve">Situación Propuesta de </w:t>
+                    <w:t xml:space="preserve">Situación </w:t>
                   </w:r>
                   <w:r>
                     <w:rPr>
                       <w:rFonts w:ascii="Arial" w:hAnsi="Arial"/>
                       <w:b/>
-                      <w:spacing w:val="-2"/>
-                      <w:sz w:val="18"/>
-                    </w:rPr>
-                    <w:t>Formación</w:t>
+                      <w:sz w:val="18"/>
+                    </w:rPr>
+                    <w:t>{</w:t>
+                  </w:r>
+                  <w:proofErr w:type="spellStart"/>
+                  <w:r>
+                    <w:rPr>
+                      <w:rFonts w:ascii="Arial" w:hAnsi="Arial"/>
+                      <w:b/>
+                      <w:sz w:val="18"/>
+                    </w:rPr>
+                    <w:t>situacion</w:t>
+                  </w:r>
+                  <w:proofErr w:type="spellEnd"/>
+                  <w:r>
+                    <w:rPr>
+                      <w:rFonts w:ascii="Arial" w:hAnsi="Arial"/>
+                      <w:b/>
+                      <w:sz w:val="18"/>
+                    </w:rPr>
+                    <w:t>} de Formación</w:t>
                   </w:r>
                 </w:p>
               </w:tc>
@@ -7567,7 +7641,6 @@
                   <w:pPr>
                     <w:pStyle w:val="TableParagraph"/>
                     <w:spacing w:before="1"/>
-                    <w:ind w:left="200"/>
                     <w:rPr>
                       <w:sz w:val="16"/>
                     </w:rPr>
@@ -7598,7 +7671,6 @@
                   <w:pPr>
                     <w:pStyle w:val="TableParagraph"/>
                     <w:spacing w:before="1"/>
-                    <w:ind w:left="200"/>
                     <w:rPr>
                       <w:sz w:val="16"/>
                     </w:rPr>
@@ -7608,7 +7680,22 @@
                       <w:spacing w:val="-2"/>
                       <w:sz w:val="16"/>
                     </w:rPr>
-                    <w:t>{Respuesta6}</w:t>
+                    <w:t>{</w:t>
+                  </w:r>
+                  <w:proofErr w:type="spellStart"/>
+                  <w:r>
+                    <w:rPr>
+                      <w:sz w:val="16"/>
+                    </w:rPr>
+                    <w:t>NombreFormaciónEspecifica</w:t>
+                  </w:r>
+                  <w:proofErr w:type="spellEnd"/>
+                  <w:r>
+                    <w:rPr>
+                      <w:spacing w:val="-2"/>
+                      <w:sz w:val="16"/>
+                    </w:rPr>
+                    <w:t>}</w:t>
                   </w:r>
                 </w:p>
               </w:tc>
@@ -7627,7 +7714,6 @@
                   <w:pPr>
                     <w:pStyle w:val="TableParagraph"/>
                     <w:spacing w:before="45" w:line="165" w:lineRule="exact"/>
-                    <w:ind w:left="200"/>
                     <w:rPr>
                       <w:sz w:val="16"/>
                     </w:rPr>
@@ -7925,12 +8011,14 @@
                     </w:rPr>
                     <w:t>{</w:t>
                   </w:r>
+                  <w:proofErr w:type="spellStart"/>
                   <w:r>
                     <w:rPr>
                       <w:sz w:val="16"/>
                     </w:rPr>
                     <w:t>NombreFormaciónEspecifica</w:t>
                   </w:r>
+                  <w:proofErr w:type="spellEnd"/>
                   <w:r>
                     <w:rPr>
                       <w:sz w:val="16"/>
@@ -7960,12 +8048,14 @@
                     </w:rPr>
                     <w:t>{</w:t>
                   </w:r>
+                  <w:proofErr w:type="spellStart"/>
                   <w:r>
                     <w:rPr>
                       <w:sz w:val="16"/>
                     </w:rPr>
                     <w:t>NivelFormaciónEspecifica</w:t>
                   </w:r>
+                  <w:proofErr w:type="spellEnd"/>
                   <w:r>
                     <w:rPr>
                       <w:sz w:val="16"/>
@@ -7998,12 +8088,14 @@
                     </w:rPr>
                     <w:t>{</w:t>
                   </w:r>
+                  <w:proofErr w:type="spellStart"/>
                   <w:r>
                     <w:rPr>
                       <w:sz w:val="16"/>
                     </w:rPr>
                     <w:t>FechaInicioE</w:t>
                   </w:r>
+                  <w:proofErr w:type="spellEnd"/>
                   <w:r>
                     <w:rPr>
                       <w:sz w:val="16"/>
@@ -8036,12 +8128,14 @@
                     </w:rPr>
                     <w:t>{</w:t>
                   </w:r>
+                  <w:proofErr w:type="spellStart"/>
                   <w:r>
                     <w:rPr>
                       <w:sz w:val="16"/>
                     </w:rPr>
                     <w:t>FechaFinE</w:t>
                   </w:r>
+                  <w:proofErr w:type="spellEnd"/>
                   <w:r>
                     <w:rPr>
                       <w:sz w:val="16"/>
@@ -8104,12 +8198,14 @@
                     </w:rPr>
                     <w:t>{</w:t>
                   </w:r>
+                  <w:proofErr w:type="spellStart"/>
                   <w:r>
                     <w:rPr>
                       <w:sz w:val="16"/>
                     </w:rPr>
                     <w:t>NombreFormaciónGenerica</w:t>
                   </w:r>
+                  <w:proofErr w:type="spellEnd"/>
                   <w:r>
                     <w:rPr>
                       <w:sz w:val="16"/>
@@ -8142,12 +8238,14 @@
                     </w:rPr>
                     <w:t>{</w:t>
                   </w:r>
+                  <w:proofErr w:type="spellStart"/>
                   <w:r>
                     <w:rPr>
                       <w:sz w:val="16"/>
                     </w:rPr>
                     <w:t>NivelFormaciónGenerica</w:t>
                   </w:r>
+                  <w:proofErr w:type="spellEnd"/>
                   <w:r>
                     <w:rPr>
                       <w:sz w:val="16"/>
@@ -8181,6 +8279,7 @@
                     </w:rPr>
                     <w:t>{</w:t>
                   </w:r>
+                  <w:proofErr w:type="spellStart"/>
                   <w:r>
                     <w:rPr>
                       <w:sz w:val="16"/>
@@ -8191,7 +8290,14 @@
                     <w:rPr>
                       <w:sz w:val="16"/>
                     </w:rPr>
-                    <w:t>G}</w:t>
+                    <w:t>G</w:t>
+                  </w:r>
+                  <w:proofErr w:type="spellEnd"/>
+                  <w:r>
+                    <w:rPr>
+                      <w:sz w:val="16"/>
+                    </w:rPr>
+                    <w:t>}</w:t>
                   </w:r>
                 </w:p>
               </w:tc>
@@ -8220,6 +8326,7 @@
                     </w:rPr>
                     <w:t>{</w:t>
                   </w:r>
+                  <w:proofErr w:type="spellStart"/>
                   <w:r>
                     <w:rPr>
                       <w:sz w:val="16"/>
@@ -8230,7 +8337,14 @@
                     <w:rPr>
                       <w:sz w:val="16"/>
                     </w:rPr>
-                    <w:t>G}</w:t>
+                    <w:t>G</w:t>
+                  </w:r>
+                  <w:proofErr w:type="spellEnd"/>
+                  <w:r>
+                    <w:rPr>
+                      <w:sz w:val="16"/>
+                    </w:rPr>
+                    <w:t>}</w:t>
                   </w:r>
                 </w:p>
               </w:tc>
@@ -8975,7 +9089,7 @@
 </file>
 
 <file path=word/endnotes.xml><?xml version="1.0" encoding="utf-8"?>
-<w:endnotes xmlns:wpc="http://schemas.microsoft.com/office/word/2010/wordprocessingCanvas" xmlns:cx="http://schemas.microsoft.com/office/drawing/2014/chartex" xmlns:cx1="http://schemas.microsoft.com/office/drawing/2015/9/8/chartex" xmlns:cx2="http://schemas.microsoft.com/office/drawing/2015/10/21/chartex" xmlns:cx3="http://schemas.microsoft.com/office/drawing/2016/5/9/chartex" xmlns:cx4="http://schemas.microsoft.com/office/drawing/2016/5/10/chartex" xmlns:cx5="http://schemas.microsoft.com/office/drawing/2016/5/11/chartex" xmlns:cx6="http://schemas.microsoft.com/office/drawing/2016/5/12/chartex" xmlns:cx7="http://schemas.microsoft.com/office/drawing/2016/5/13/chartex" xmlns:cx8="http://schemas.microsoft.com/office/drawing/2016/5/14/chartex" xmlns:mc="http://schemas.openxmlformats.org/markup-compatibility/2006" xmlns:aink="http://schemas.microsoft.com/office/drawing/2016/ink" xmlns:am3d="http://schemas.microsoft.com/office/drawing/2017/model3d" xmlns:o="urn:schemas-microsoft-com:office:office" xmlns:oel="http://schemas.microsoft.com/office/2019/extlst" xmlns:r="http://schemas.openxmlformats.org/officeDocument/2006/relationships" xmlns:m="http://schemas.openxmlformats.org/officeDocument/2006/math" xmlns:v="urn:schemas-microsoft-com:vml" xmlns:wp14="http://schemas.microsoft.com/office/word/2010/wordprocessingDrawing" xmlns:wp="http://schemas.openxmlformats.org/drawingml/2006/wordprocessingDrawing" xmlns:w10="urn:schemas-microsoft-com:office:word" xmlns:w="http://schemas.openxmlformats.org/wordprocessingml/2006/main" xmlns:w14="http://schemas.microsoft.com/office/word/2010/wordml" xmlns:w15="http://schemas.microsoft.com/office/word/2012/wordml" xmlns:w16cex="http://schemas.microsoft.com/office/word/2018/wordml/cex" xmlns:w16cid="http://schemas.microsoft.com/office/word/2016/wordml/cid" xmlns:w16="http://schemas.microsoft.com/office/word/2018/wordml" xmlns:w16du="http://schemas.microsoft.com/office/word/2023/wordml/word16du" xmlns:w16sdtdh="http://schemas.microsoft.com/office/word/2020/wordml/sdtdatahash" xmlns:w16sdtfl="http://schemas.microsoft.com/office/word/2024/wordml/sdtformatlock" xmlns:w16se="http://schemas.microsoft.com/office/word/2015/wordml/symex" xmlns:wpg="http://schemas.microsoft.com/office/word/2010/wordprocessingGroup" xmlns:wpi="http://schemas.microsoft.com/office/word/2010/wordprocessingInk" xmlns:wne="http://schemas.microsoft.com/office/word/2006/wordml" xmlns:wps="http://schemas.microsoft.com/office/word/2010/wordprocessingShape" mc:Ignorable="w14 w15 w16se w16cid w16 w16cex w16sdtdh w16sdtfl w16du wp14">
+<w:endnotes xmlns:wpc="http://schemas.microsoft.com/office/word/2010/wordprocessingCanvas" xmlns:cx="http://schemas.microsoft.com/office/drawing/2014/chartex" xmlns:cx1="http://schemas.microsoft.com/office/drawing/2015/9/8/chartex" xmlns:cx2="http://schemas.microsoft.com/office/drawing/2015/10/21/chartex" xmlns:cx3="http://schemas.microsoft.com/office/drawing/2016/5/9/chartex" xmlns:cx4="http://schemas.microsoft.com/office/drawing/2016/5/10/chartex" xmlns:cx5="http://schemas.microsoft.com/office/drawing/2016/5/11/chartex" xmlns:cx6="http://schemas.microsoft.com/office/drawing/2016/5/12/chartex" xmlns:cx7="http://schemas.microsoft.com/office/drawing/2016/5/13/chartex" xmlns:cx8="http://schemas.microsoft.com/office/drawing/2016/5/14/chartex" xmlns:mc="http://schemas.openxmlformats.org/markup-compatibility/2006" xmlns:aink="http://schemas.microsoft.com/office/drawing/2016/ink" xmlns:am3d="http://schemas.microsoft.com/office/drawing/2017/model3d" xmlns:o="urn:schemas-microsoft-com:office:office" xmlns:oel="http://schemas.microsoft.com/office/2019/extlst" xmlns:r="http://schemas.openxmlformats.org/officeDocument/2006/relationships" xmlns:m="http://schemas.openxmlformats.org/officeDocument/2006/math" xmlns:v="urn:schemas-microsoft-com:vml" xmlns:wp14="http://schemas.microsoft.com/office/word/2010/wordprocessingDrawing" xmlns:wp="http://schemas.openxmlformats.org/drawingml/2006/wordprocessingDrawing" xmlns:w10="urn:schemas-microsoft-com:office:word" xmlns:w="http://schemas.openxmlformats.org/wordprocessingml/2006/main" xmlns:w14="http://schemas.microsoft.com/office/word/2010/wordml" xmlns:w15="http://schemas.microsoft.com/office/word/2012/wordml" xmlns:w16cex="http://schemas.microsoft.com/office/word/2018/wordml/cex" xmlns:w16cid="http://schemas.microsoft.com/office/word/2016/wordml/cid" xmlns:w16="http://schemas.microsoft.com/office/word/2018/wordml" xmlns:w16sdtdh="http://schemas.microsoft.com/office/word/2020/wordml/sdtdatahash" xmlns:w16se="http://schemas.microsoft.com/office/word/2015/wordml/symex" xmlns:wpg="http://schemas.microsoft.com/office/word/2010/wordprocessingGroup" xmlns:wpi="http://schemas.microsoft.com/office/word/2010/wordprocessingInk" xmlns:wne="http://schemas.microsoft.com/office/word/2006/wordml" xmlns:wps="http://schemas.microsoft.com/office/word/2010/wordprocessingShape" mc:Ignorable="w14 w15 w16se w16cid w16 w16cex w16sdtdh wp14">
   <w:endnote w:type="separator" w:id="-1">
     <w:p>
       <w:r>
@@ -8994,7 +9108,7 @@
 </file>
 
 <file path=word/footnotes.xml><?xml version="1.0" encoding="utf-8"?>
-<w:footnotes xmlns:wpc="http://schemas.microsoft.com/office/word/2010/wordprocessingCanvas" xmlns:cx="http://schemas.microsoft.com/office/drawing/2014/chartex" xmlns:cx1="http://schemas.microsoft.com/office/drawing/2015/9/8/chartex" xmlns:cx2="http://schemas.microsoft.com/office/drawing/2015/10/21/chartex" xmlns:cx3="http://schemas.microsoft.com/office/drawing/2016/5/9/chartex" xmlns:cx4="http://schemas.microsoft.com/office/drawing/2016/5/10/chartex" xmlns:cx5="http://schemas.microsoft.com/office/drawing/2016/5/11/chartex" xmlns:cx6="http://schemas.microsoft.com/office/drawing/2016/5/12/chartex" xmlns:cx7="http://schemas.microsoft.com/office/drawing/2016/5/13/chartex" xmlns:cx8="http://schemas.microsoft.com/office/drawing/2016/5/14/chartex" xmlns:mc="http://schemas.openxmlformats.org/markup-compatibility/2006" xmlns:aink="http://schemas.microsoft.com/office/drawing/2016/ink" xmlns:am3d="http://schemas.microsoft.com/office/drawing/2017/model3d" xmlns:o="urn:schemas-microsoft-com:office:office" xmlns:oel="http://schemas.microsoft.com/office/2019/extlst" xmlns:r="http://schemas.openxmlformats.org/officeDocument/2006/relationships" xmlns:m="http://schemas.openxmlformats.org/officeDocument/2006/math" xmlns:v="urn:schemas-microsoft-com:vml" xmlns:wp14="http://schemas.microsoft.com/office/word/2010/wordprocessingDrawing" xmlns:wp="http://schemas.openxmlformats.org/drawingml/2006/wordprocessingDrawing" xmlns:w10="urn:schemas-microsoft-com:office:word" xmlns:w="http://schemas.openxmlformats.org/wordprocessingml/2006/main" xmlns:w14="http://schemas.microsoft.com/office/word/2010/wordml" xmlns:w15="http://schemas.microsoft.com/office/word/2012/wordml" xmlns:w16cex="http://schemas.microsoft.com/office/word/2018/wordml/cex" xmlns:w16cid="http://schemas.microsoft.com/office/word/2016/wordml/cid" xmlns:w16="http://schemas.microsoft.com/office/word/2018/wordml" xmlns:w16du="http://schemas.microsoft.com/office/word/2023/wordml/word16du" xmlns:w16sdtdh="http://schemas.microsoft.com/office/word/2020/wordml/sdtdatahash" xmlns:w16sdtfl="http://schemas.microsoft.com/office/word/2024/wordml/sdtformatlock" xmlns:w16se="http://schemas.microsoft.com/office/word/2015/wordml/symex" xmlns:wpg="http://schemas.microsoft.com/office/word/2010/wordprocessingGroup" xmlns:wpi="http://schemas.microsoft.com/office/word/2010/wordprocessingInk" xmlns:wne="http://schemas.microsoft.com/office/word/2006/wordml" xmlns:wps="http://schemas.microsoft.com/office/word/2010/wordprocessingShape" mc:Ignorable="w14 w15 w16se w16cid w16 w16cex w16sdtdh w16sdtfl w16du wp14">
+<w:footnotes xmlns:wpc="http://schemas.microsoft.com/office/word/2010/wordprocessingCanvas" xmlns:cx="http://schemas.microsoft.com/office/drawing/2014/chartex" xmlns:cx1="http://schemas.microsoft.com/office/drawing/2015/9/8/chartex" xmlns:cx2="http://schemas.microsoft.com/office/drawing/2015/10/21/chartex" xmlns:cx3="http://schemas.microsoft.com/office/drawing/2016/5/9/chartex" xmlns:cx4="http://schemas.microsoft.com/office/drawing/2016/5/10/chartex" xmlns:cx5="http://schemas.microsoft.com/office/drawing/2016/5/11/chartex" xmlns:cx6="http://schemas.microsoft.com/office/drawing/2016/5/12/chartex" xmlns:cx7="http://schemas.microsoft.com/office/drawing/2016/5/13/chartex" xmlns:cx8="http://schemas.microsoft.com/office/drawing/2016/5/14/chartex" xmlns:mc="http://schemas.openxmlformats.org/markup-compatibility/2006" xmlns:aink="http://schemas.microsoft.com/office/drawing/2016/ink" xmlns:am3d="http://schemas.microsoft.com/office/drawing/2017/model3d" xmlns:o="urn:schemas-microsoft-com:office:office" xmlns:oel="http://schemas.microsoft.com/office/2019/extlst" xmlns:r="http://schemas.openxmlformats.org/officeDocument/2006/relationships" xmlns:m="http://schemas.openxmlformats.org/officeDocument/2006/math" xmlns:v="urn:schemas-microsoft-com:vml" xmlns:wp14="http://schemas.microsoft.com/office/word/2010/wordprocessingDrawing" xmlns:wp="http://schemas.openxmlformats.org/drawingml/2006/wordprocessingDrawing" xmlns:w10="urn:schemas-microsoft-com:office:word" xmlns:w="http://schemas.openxmlformats.org/wordprocessingml/2006/main" xmlns:w14="http://schemas.microsoft.com/office/word/2010/wordml" xmlns:w15="http://schemas.microsoft.com/office/word/2012/wordml" xmlns:w16cex="http://schemas.microsoft.com/office/word/2018/wordml/cex" xmlns:w16cid="http://schemas.microsoft.com/office/word/2016/wordml/cid" xmlns:w16="http://schemas.microsoft.com/office/word/2018/wordml" xmlns:w16sdtdh="http://schemas.microsoft.com/office/word/2020/wordml/sdtdatahash" xmlns:w16se="http://schemas.microsoft.com/office/word/2015/wordml/symex" xmlns:wpg="http://schemas.microsoft.com/office/word/2010/wordprocessingGroup" xmlns:wpi="http://schemas.microsoft.com/office/word/2010/wordprocessingInk" xmlns:wne="http://schemas.microsoft.com/office/word/2006/wordml" xmlns:wps="http://schemas.microsoft.com/office/word/2010/wordprocessingShape" mc:Ignorable="w14 w15 w16se w16cid w16 w16cex w16sdtdh wp14">
   <w:footnote w:type="separator" w:id="-1">
     <w:p>
       <w:r>
@@ -9013,7 +9127,7 @@
 </file>
 
 <file path=word/numbering.xml><?xml version="1.0" encoding="utf-8"?>
-<w:numbering xmlns:wpc="http://schemas.microsoft.com/office/word/2010/wordprocessingCanvas" xmlns:cx="http://schemas.microsoft.com/office/drawing/2014/chartex" xmlns:cx1="http://schemas.microsoft.com/office/drawing/2015/9/8/chartex" xmlns:cx2="http://schemas.microsoft.com/office/drawing/2015/10/21/chartex" xmlns:cx3="http://schemas.microsoft.com/office/drawing/2016/5/9/chartex" xmlns:cx4="http://schemas.microsoft.com/office/drawing/2016/5/10/chartex" xmlns:cx5="http://schemas.microsoft.com/office/drawing/2016/5/11/chartex" xmlns:cx6="http://schemas.microsoft.com/office/drawing/2016/5/12/chartex" xmlns:cx7="http://schemas.microsoft.com/office/drawing/2016/5/13/chartex" xmlns:cx8="http://schemas.microsoft.com/office/drawing/2016/5/14/chartex" xmlns:mc="http://schemas.openxmlformats.org/markup-compatibility/2006" xmlns:aink="http://schemas.microsoft.com/office/drawing/2016/ink" xmlns:am3d="http://schemas.microsoft.com/office/drawing/2017/model3d" xmlns:o="urn:schemas-microsoft-com:office:office" xmlns:oel="http://schemas.microsoft.com/office/2019/extlst" xmlns:r="http://schemas.openxmlformats.org/officeDocument/2006/relationships" xmlns:m="http://schemas.openxmlformats.org/officeDocument/2006/math" xmlns:v="urn:schemas-microsoft-com:vml" xmlns:wp14="http://schemas.microsoft.com/office/word/2010/wordprocessingDrawing" xmlns:wp="http://schemas.openxmlformats.org/drawingml/2006/wordprocessingDrawing" xmlns:w10="urn:schemas-microsoft-com:office:word" xmlns:w="http://schemas.openxmlformats.org/wordprocessingml/2006/main" xmlns:w14="http://schemas.microsoft.com/office/word/2010/wordml" xmlns:w15="http://schemas.microsoft.com/office/word/2012/wordml" xmlns:w16cex="http://schemas.microsoft.com/office/word/2018/wordml/cex" xmlns:w16cid="http://schemas.microsoft.com/office/word/2016/wordml/cid" xmlns:w16="http://schemas.microsoft.com/office/word/2018/wordml" xmlns:w16du="http://schemas.microsoft.com/office/word/2023/wordml/word16du" xmlns:w16sdtdh="http://schemas.microsoft.com/office/word/2020/wordml/sdtdatahash" xmlns:w16sdtfl="http://schemas.microsoft.com/office/word/2024/wordml/sdtformatlock" xmlns:w16se="http://schemas.microsoft.com/office/word/2015/wordml/symex" xmlns:wpg="http://schemas.microsoft.com/office/word/2010/wordprocessingGroup" xmlns:wpi="http://schemas.microsoft.com/office/word/2010/wordprocessingInk" xmlns:wne="http://schemas.microsoft.com/office/word/2006/wordml" xmlns:wps="http://schemas.microsoft.com/office/word/2010/wordprocessingShape" mc:Ignorable="w14 w15 w16se w16cid w16 w16cex w16sdtdh w16sdtfl w16du wp14">
+<w:numbering xmlns:wpc="http://schemas.microsoft.com/office/word/2010/wordprocessingCanvas" xmlns:cx="http://schemas.microsoft.com/office/drawing/2014/chartex" xmlns:cx1="http://schemas.microsoft.com/office/drawing/2015/9/8/chartex" xmlns:cx2="http://schemas.microsoft.com/office/drawing/2015/10/21/chartex" xmlns:cx3="http://schemas.microsoft.com/office/drawing/2016/5/9/chartex" xmlns:cx4="http://schemas.microsoft.com/office/drawing/2016/5/10/chartex" xmlns:cx5="http://schemas.microsoft.com/office/drawing/2016/5/11/chartex" xmlns:cx6="http://schemas.microsoft.com/office/drawing/2016/5/12/chartex" xmlns:cx7="http://schemas.microsoft.com/office/drawing/2016/5/13/chartex" xmlns:cx8="http://schemas.microsoft.com/office/drawing/2016/5/14/chartex" xmlns:mc="http://schemas.openxmlformats.org/markup-compatibility/2006" xmlns:aink="http://schemas.microsoft.com/office/drawing/2016/ink" xmlns:am3d="http://schemas.microsoft.com/office/drawing/2017/model3d" xmlns:o="urn:schemas-microsoft-com:office:office" xmlns:oel="http://schemas.microsoft.com/office/2019/extlst" xmlns:r="http://schemas.openxmlformats.org/officeDocument/2006/relationships" xmlns:m="http://schemas.openxmlformats.org/officeDocument/2006/math" xmlns:v="urn:schemas-microsoft-com:vml" xmlns:wp14="http://schemas.microsoft.com/office/word/2010/wordprocessingDrawing" xmlns:wp="http://schemas.openxmlformats.org/drawingml/2006/wordprocessingDrawing" xmlns:w10="urn:schemas-microsoft-com:office:word" xmlns:w="http://schemas.openxmlformats.org/wordprocessingml/2006/main" xmlns:w14="http://schemas.microsoft.com/office/word/2010/wordml" xmlns:w15="http://schemas.microsoft.com/office/word/2012/wordml" xmlns:w16cex="http://schemas.microsoft.com/office/word/2018/wordml/cex" xmlns:w16cid="http://schemas.microsoft.com/office/word/2016/wordml/cid" xmlns:w16="http://schemas.microsoft.com/office/word/2018/wordml" xmlns:w16sdtdh="http://schemas.microsoft.com/office/word/2020/wordml/sdtdatahash" xmlns:w16se="http://schemas.microsoft.com/office/word/2015/wordml/symex" xmlns:wpg="http://schemas.microsoft.com/office/word/2010/wordprocessingGroup" xmlns:wpi="http://schemas.microsoft.com/office/word/2010/wordprocessingInk" xmlns:wne="http://schemas.microsoft.com/office/word/2006/wordml" xmlns:wps="http://schemas.microsoft.com/office/word/2010/wordprocessingShape" mc:Ignorable="w14 w15 w16se w16cid w16 w16cex w16sdtdh wp14">
   <w:abstractNum w:abstractNumId="0" w15:restartNumberingAfterBreak="0">
     <w:nsid w:val="113E38C6"/>
     <w:multiLevelType w:val="hybridMultilevel"/>
@@ -9879,7 +9993,7 @@
 </file>
 
 <file path=word/styles.xml><?xml version="1.0" encoding="utf-8"?>
-<w:styles xmlns:mc="http://schemas.openxmlformats.org/markup-compatibility/2006" xmlns:r="http://schemas.openxmlformats.org/officeDocument/2006/relationships" xmlns:w="http://schemas.openxmlformats.org/wordprocessingml/2006/main" xmlns:w14="http://schemas.microsoft.com/office/word/2010/wordml" xmlns:w15="http://schemas.microsoft.com/office/word/2012/wordml" xmlns:w16cex="http://schemas.microsoft.com/office/word/2018/wordml/cex" xmlns:w16cid="http://schemas.microsoft.com/office/word/2016/wordml/cid" xmlns:w16="http://schemas.microsoft.com/office/word/2018/wordml" xmlns:w16du="http://schemas.microsoft.com/office/word/2023/wordml/word16du" xmlns:w16sdtdh="http://schemas.microsoft.com/office/word/2020/wordml/sdtdatahash" xmlns:w16sdtfl="http://schemas.microsoft.com/office/word/2024/wordml/sdtformatlock" xmlns:w16se="http://schemas.microsoft.com/office/word/2015/wordml/symex" mc:Ignorable="w14 w15 w16se w16cid w16 w16cex w16sdtdh w16sdtfl w16du">
+<w:styles xmlns:mc="http://schemas.openxmlformats.org/markup-compatibility/2006" xmlns:r="http://schemas.openxmlformats.org/officeDocument/2006/relationships" xmlns:w="http://schemas.openxmlformats.org/wordprocessingml/2006/main" xmlns:w14="http://schemas.microsoft.com/office/word/2010/wordml" xmlns:w15="http://schemas.microsoft.com/office/word/2012/wordml" xmlns:w16cex="http://schemas.microsoft.com/office/word/2018/wordml/cex" xmlns:w16cid="http://schemas.microsoft.com/office/word/2016/wordml/cid" xmlns:w16="http://schemas.microsoft.com/office/word/2018/wordml" xmlns:w16sdtdh="http://schemas.microsoft.com/office/word/2020/wordml/sdtdatahash" xmlns:w16se="http://schemas.microsoft.com/office/word/2015/wordml/symex" mc:Ignorable="w14 w15 w16se w16cid w16 w16cex w16sdtdh">
   <w:docDefaults>
     <w:rPrDefault>
       <w:rPr>
@@ -10494,6 +10608,7 @@
   <w:style w:type="character" w:default="1" w:styleId="Fuentedeprrafopredeter">
     <w:name w:val="Default Paragraph Font"/>
     <w:uiPriority w:val="1"/>
+    <w:semiHidden/>
     <w:unhideWhenUsed/>
   </w:style>
   <w:style w:type="table" w:default="1" w:styleId="Tablanormal">
@@ -11247,17 +11362,6 @@
 </file>
 
 <file path=customXml/item1.xml><?xml version="1.0" encoding="utf-8"?>
-<p:properties xmlns:p="http://schemas.microsoft.com/office/2006/metadata/properties" xmlns:xsi="http://www.w3.org/2001/XMLSchema-instance" xmlns:pc="http://schemas.microsoft.com/office/infopath/2007/PartnerControls">
-  <documentManagement>
-    <TaxCatchAll xmlns="27118ee3-1735-4bf8-b1d8-b92405a04e3d" xsi:nil="true"/>
-    <lcf76f155ced4ddcb4097134ff3c332f xmlns="99f51e6f-0b5b-434c-9b36-ed35023571bc">
-      <Terms xmlns="http://schemas.microsoft.com/office/infopath/2007/PartnerControls"/>
-    </lcf76f155ced4ddcb4097134ff3c332f>
-  </documentManagement>
-</p:properties>
-</file>
-
-<file path=customXml/item2.xml><?xml version="1.0" encoding="utf-8"?>
 <ct:contentTypeSchema xmlns:ct="http://schemas.microsoft.com/office/2006/metadata/contentType" xmlns:ma="http://schemas.microsoft.com/office/2006/metadata/properties/metaAttributes" ct:_="" ma:_="" ma:contentTypeName="Documento" ma:contentTypeID="0x010100AFCCB6245C987745891279558BDB0B3B" ma:contentTypeVersion="10" ma:contentTypeDescription="Crear nuevo documento." ma:contentTypeScope="" ma:versionID="db2b1ef01224d0e4c869899219de097e">
   <xsd:schema xmlns:xsd="http://www.w3.org/2001/XMLSchema" xmlns:xs="http://www.w3.org/2001/XMLSchema" xmlns:p="http://schemas.microsoft.com/office/2006/metadata/properties" xmlns:ns2="99f51e6f-0b5b-434c-9b36-ed35023571bc" xmlns:ns3="27118ee3-1735-4bf8-b1d8-b92405a04e3d" targetNamespace="http://schemas.microsoft.com/office/2006/metadata/properties" ma:root="true" ma:fieldsID="0535449ddeeed03297b3b93236c6a265" ns2:_="" ns3:_="">
     <xsd:import namespace="99f51e6f-0b5b-434c-9b36-ed35023571bc"/>
@@ -11446,7 +11550,7 @@
 </ct:contentTypeSchema>
 </file>
 
-<file path=customXml/item3.xml><?xml version="1.0" encoding="utf-8"?>
+<file path=customXml/item2.xml><?xml version="1.0" encoding="utf-8"?>
 <?mso-contentType ?>
 <FormTemplates xmlns="http://schemas.microsoft.com/sharepoint/v3/contenttype/forms">
   <Display>DocumentLibraryForm</Display>
@@ -11455,18 +11559,18 @@
 </FormTemplates>
 </file>
 
-<file path=customXml/itemProps1.xml><?xml version="1.0" encoding="utf-8"?>
-<ds:datastoreItem xmlns:ds="http://schemas.openxmlformats.org/officeDocument/2006/customXml" ds:itemID="{13D1DF26-15E7-4CB8-BF6B-6E5B7C532BE3}">
-  <ds:schemaRefs>
-    <ds:schemaRef ds:uri="http://schemas.microsoft.com/office/2006/metadata/properties"/>
-    <ds:schemaRef ds:uri="http://schemas.microsoft.com/office/infopath/2007/PartnerControls"/>
-    <ds:schemaRef ds:uri="27118ee3-1735-4bf8-b1d8-b92405a04e3d"/>
-    <ds:schemaRef ds:uri="99f51e6f-0b5b-434c-9b36-ed35023571bc"/>
-  </ds:schemaRefs>
-</ds:datastoreItem>
+<file path=customXml/item3.xml><?xml version="1.0" encoding="utf-8"?>
+<p:properties xmlns:p="http://schemas.microsoft.com/office/2006/metadata/properties" xmlns:xsi="http://www.w3.org/2001/XMLSchema-instance" xmlns:pc="http://schemas.microsoft.com/office/infopath/2007/PartnerControls">
+  <documentManagement>
+    <TaxCatchAll xmlns="27118ee3-1735-4bf8-b1d8-b92405a04e3d" xsi:nil="true"/>
+    <lcf76f155ced4ddcb4097134ff3c332f xmlns="99f51e6f-0b5b-434c-9b36-ed35023571bc">
+      <Terms xmlns="http://schemas.microsoft.com/office/infopath/2007/PartnerControls"/>
+    </lcf76f155ced4ddcb4097134ff3c332f>
+  </documentManagement>
+</p:properties>
 </file>
 
-<file path=customXml/itemProps2.xml><?xml version="1.0" encoding="utf-8"?>
+<file path=customXml/itemProps1.xml><?xml version="1.0" encoding="utf-8"?>
 <ds:datastoreItem xmlns:ds="http://schemas.openxmlformats.org/officeDocument/2006/customXml" ds:itemID="{E29BA6FB-B8A3-484B-AAE3-F2BB7F834CDC}">
   <ds:schemaRefs>
     <ds:schemaRef ds:uri="http://schemas.microsoft.com/office/2006/metadata/contentType"/>
@@ -11485,10 +11589,21 @@
 </ds:datastoreItem>
 </file>
 
-<file path=customXml/itemProps3.xml><?xml version="1.0" encoding="utf-8"?>
+<file path=customXml/itemProps2.xml><?xml version="1.0" encoding="utf-8"?>
 <ds:datastoreItem xmlns:ds="http://schemas.openxmlformats.org/officeDocument/2006/customXml" ds:itemID="{61A0775B-211E-428E-B3DF-75E37932E561}">
   <ds:schemaRefs>
     <ds:schemaRef ds:uri="http://schemas.microsoft.com/sharepoint/v3/contenttype/forms"/>
   </ds:schemaRefs>
 </ds:datastoreItem>
+</file>
+
+<file path=customXml/itemProps3.xml><?xml version="1.0" encoding="utf-8"?>
+<ds:datastoreItem xmlns:ds="http://schemas.openxmlformats.org/officeDocument/2006/customXml" ds:itemID="{13D1DF26-15E7-4CB8-BF6B-6E5B7C532BE3}">
+  <ds:schemaRefs>
+    <ds:schemaRef ds:uri="http://schemas.microsoft.com/office/2006/metadata/properties"/>
+    <ds:schemaRef ds:uri="http://schemas.microsoft.com/office/infopath/2007/PartnerControls"/>
+    <ds:schemaRef ds:uri="27118ee3-1735-4bf8-b1d8-b92405a04e3d"/>
+    <ds:schemaRef ds:uri="99f51e6f-0b5b-434c-9b36-ed35023571bc"/>
+  </ds:schemaRefs>
+</ds:datastoreItem>
 </file>
</xml_diff>